<commit_message>
Update questionnaire draft: add Gemini to B1, refresh in-app content
Pushes the latest AI-Perceptions-Questionnaire-Draft.docx, with B1's
personal-tool option edited to include Gemini alongside ChatGPT and
Claude. Also brings lib/questionnaire.py (the "N = Everyone" tab
content) in line with this draft's other revisions: updated respondent
intro, open-text A2, 5-point scales throughout C/E/F, the adaptive
D1/D1a task filter+grid, and F4's MaxDiff-based investment-priority
exercise.
</commit_message>
<xml_diff>
--- a/questionnaire/AI-Perceptions-Questionnaire-Draft.docx
+++ b/questionnaire/AI-Perceptions-Questionnaire-Draft.docx
@@ -76,7 +76,7 @@
           <w:sz w:val="21"/>
           <w:szCs w:val="21"/>
         </w:rPr>
-        <w:t xml:space="preserve">This survey asks about how you currently use AI tools in your work, what's working and what isn't, and where you'd want AI to show up differently. Your individual answers are not shared with your manager. Results are reported by service line and level, not by name. It should take about 12 to 15 minutes.</w:t>
+        <w:t xml:space="preserve">This is part of an ongoing effort to track how AI is actually showing up in people's work, so we can build on it over time rather than guess. Your honest answer today becomes part of that baseline. Results are reported by service line and title, not by name. It should take about 12 to 15 minutes.</w:t>
       </w:r>
     </w:p>
     <w:p>
@@ -91,7 +91,7 @@
           <w:sz w:val="19"/>
           <w:szCs w:val="19"/>
         </w:rPr>
-        <w:t xml:space="preserve">[PROGRAMMER: PROGRAM AS SELF-ADMINISTERED ONLINE SURVEY. RANDOMIZE ROW ORDER WHERE NOTED. ANCHOR 'NONE OF THESE' / 'NOT APPLICABLE' OPTIONS LAST WHERE PRESENT.]</w:t>
+        <w:t xml:space="preserve">[PROGRAMMER: PROGRAM AS SELF-ADMINISTERED ONLINE SURVEY. RANDOMIZE ROW ORDER WHERE NOTED. ANCHOR 'NONE OF THESE' / 'NOT APPLICABLE' OPTIONS LAST WHERE PRESENT. INCLUDE A PROGRESS INDICATOR. FLAG RESPONDENTS WHO COMPLETE IN UNDER 3 MINUTES OR WHO SELECT THE SAME COLUMN FOR EVERY ROW OF D1a FOR QUALITY REVIEW BEFORE ANALYSIS, DO NOT AUTO-EXCLUDE, REVIEW MANUALLY.]</w:t>
       </w:r>
     </w:p>
     <w:p>
@@ -153,7 +153,7 @@
           <w:sz w:val="20"/>
           <w:szCs w:val="20"/>
         </w:rPr>
-        <w:t xml:space="preserve">[Open text or pick-list, to be finalized against actual org structure]</w:t>
+        <w:t xml:space="preserve">[Open text]</w:t>
       </w:r>
     </w:p>
     <w:p>
@@ -176,7 +176,7 @@
           <w:sz w:val="22"/>
           <w:szCs w:val="22"/>
         </w:rPr>
-        <w:t xml:space="preserve">What is your title or level?</w:t>
+        <w:t xml:space="preserve">What is your title?</w:t>
       </w:r>
     </w:p>
     <w:p>
@@ -191,7 +191,7 @@
           <w:sz w:val="20"/>
           <w:szCs w:val="20"/>
         </w:rPr>
-        <w:t xml:space="preserve">[Pick-list: Analyst, Manager, Director, Client Officer, VP, SVP, President, CEO, Other — to be finalized]</w:t>
+        <w:t xml:space="preserve">[Open text]</w:t>
       </w:r>
     </w:p>
     <w:p>
@@ -416,7 +416,7 @@
           <w:sz w:val="21"/>
           <w:szCs w:val="21"/>
         </w:rPr>
-        <w:t xml:space="preserve">A personal ChatGPT, Claude, or similar account, used for work tasks</w:t>
+        <w:t xml:space="preserve">A personal ChatGPT, Claude, Gemini, or similar account, used for work tasks</w:t>
       </w:r>
     </w:p>
     <w:p>
@@ -1811,7 +1811,7 @@
           <w:sz w:val="20"/>
           <w:szCs w:val="20"/>
         </w:rPr>
-        <w:t xml:space="preserve">1 = Poor, does not fit how I actually work, 7 = Excellent, well suited to my work</w:t>
+        <w:t xml:space="preserve">1 = Poor, does not fit how I actually work, 5 = Excellent, well suited to my work</w:t>
       </w:r>
     </w:p>
     <w:p>
@@ -1826,7 +1826,7 @@
           <w:sz w:val="20"/>
           <w:szCs w:val="20"/>
         </w:rPr>
-        <w:t xml:space="preserve">[7-point scale]</w:t>
+        <w:t xml:space="preserve">[5-point scale]</w:t>
       </w:r>
     </w:p>
     <w:p>
@@ -1850,7 +1850,7 @@
           <w:sz w:val="20"/>
           <w:szCs w:val="20"/>
         </w:rPr>
-        <w:t xml:space="preserve">This section identifies where AI could realistically take on parts of the respondent's actual workflow, task by task, rather than asking about AI in the abstract.</w:t>
+        <w:t xml:space="preserve">This section identifies where AI could realistically take on parts of the respondent's actual workflow, task by task, rather than asking about AI in the abstract. Split into two steps to keep the grid short and reduce straightlining.</w:t>
       </w:r>
     </w:p>
     <w:p>
@@ -1873,7 +1873,7 @@
           <w:sz w:val="22"/>
           <w:szCs w:val="22"/>
         </w:rPr>
-        <w:t xml:space="preserve">Think about a typical week in your role. For each task type below: do you spend meaningful time on it, and if so, could AI take it on?</w:t>
+        <w:t xml:space="preserve">Which of the following do you spend meaningful time on in a typical week? Select all that apply.</w:t>
       </w:r>
     </w:p>
     <w:p>
@@ -1888,7 +1888,60 @@
           <w:sz w:val="19"/>
           <w:szCs w:val="19"/>
         </w:rPr>
-        <w:t xml:space="preserve">[PROGRAMMER: SHOW TASK BANK AS ROWS, RANDOMIZE ORDER. FOR EACH ROW ONLY ASKED IF 'YES' TO COLUMN 1, SHOW COLUMNS 2 AND 3.]</w:t>
+        <w:t xml:space="preserve">[PROGRAMMER: SHOW TASK BANK, RANDOMIZE ROW ORDER. THIS IS A FILTER QUESTION, NOT SCORED, IT DETERMINES WHICH ROWS APPEAR IN D1a.]</w:t>
+      </w:r>
+    </w:p>
+    <w:p>
+      <w:pPr>
+        <w:spacing w:after="60"/>
+      </w:pPr>
+      <w:r>
+        <w:rPr>
+          <w:i/>
+          <w:iCs/>
+          <w:color w:val="555555"/>
+          <w:sz w:val="20"/>
+          <w:szCs w:val="20"/>
+        </w:rPr>
+        <w:t xml:space="preserve">Options: Research data pre-processing, Research execution, Design/concept work, Writing, Emailing, Deliverable creation, Translating language, AI moderation, Research support, Supporting thinking through something (second set of eyes), Knowledge summarization, Design generation, Image generation, Document creation, Knowledge interaction, Information retrieval, Administrative execution, Other</w:t>
+      </w:r>
+    </w:p>
+    <w:p>
+      <w:pPr>
+        <w:spacing w:after="40" w:before="140"/>
+      </w:pPr>
+      <w:r>
+        <w:rPr>
+          <w:b/>
+          <w:bCs/>
+          <w:sz w:val="22"/>
+          <w:szCs w:val="22"/>
+        </w:rPr>
+        <w:t xml:space="preserve">D1a. </w:t>
+      </w:r>
+      <w:r>
+        <w:rPr>
+          <w:b/>
+          <w:bCs/>
+          <w:sz w:val="22"/>
+          <w:szCs w:val="22"/>
+        </w:rPr>
+        <w:t xml:space="preserve">For each task you selected above, could AI take it on, and how meaningful is it to you personally?</w:t>
+      </w:r>
+    </w:p>
+    <w:p>
+      <w:pPr>
+        <w:spacing w:after="80"/>
+      </w:pPr>
+      <w:r>
+        <w:rPr>
+          <w:i/>
+          <w:iCs/>
+          <w:color w:val="A8532F"/>
+          <w:sz w:val="19"/>
+          <w:szCs w:val="19"/>
+        </w:rPr>
+        <w:t xml:space="preserve">[PROGRAMMER: PIPE IN ONLY THE TASKS SELECTED AT D1 AS ROWS, SAME ORDER SHOWN. CAP AT 8 ROWS EVEN IF MORE WERE SELECTED, IF A RESPONDENT SELECTS MORE THAN 8, RANDOMLY SAMPLE 8 OF THEIR SELECTIONS RATHER THAN SHOWING ALL, TO KEEP THE GRID SHORT.]</w:t>
       </w:r>
     </w:p>
     <w:tbl>
@@ -1904,15 +1957,14 @@
         </w:tblBorders>
       </w:tblPr>
       <w:tblGrid>
-        <w:gridCol w:w="2600"/>
-        <w:gridCol w:w="2200"/>
-        <w:gridCol w:w="2600"/>
-        <w:gridCol w:w="2100"/>
+        <w:gridCol w:w="3300"/>
+        <w:gridCol w:w="3500"/>
+        <w:gridCol w:w="2700"/>
       </w:tblGrid>
       <w:tr>
         <w:tc>
           <w:tcPr>
-            <w:tcW w:type="dxa" w:w="2600"/>
+            <w:tcW w:type="dxa" w:w="3300"/>
             <w:shd w:fill="1C2B2D" w:val="clear"/>
             <w:tcMar>
               <w:top w:type="dxa" w:w="60"/>
@@ -1936,7 +1988,7 @@
         </w:tc>
         <w:tc>
           <w:tcPr>
-            <w:tcW w:type="dxa" w:w="2200"/>
+            <w:tcW w:type="dxa" w:w="3500"/>
             <w:shd w:fill="1C2B2D" w:val="clear"/>
             <w:tcMar>
               <w:top w:type="dxa" w:w="60"/>
@@ -1954,13 +2006,13 @@
                 <w:sz w:val="19"/>
                 <w:szCs w:val="19"/>
               </w:rPr>
-              <w:t xml:space="preserve">I spend meaningful time on this (Y/N)</w:t>
-            </w:r>
-          </w:p>
-        </w:tc>
-        <w:tc>
-          <w:tcPr>
-            <w:tcW w:type="dxa" w:w="2600"/>
+              <w:t xml:space="preserve">Could AI take this on? (Fully / AI drafts, I finish / Not really)</w:t>
+            </w:r>
+          </w:p>
+        </w:tc>
+        <w:tc>
+          <w:tcPr>
+            <w:tcW w:type="dxa" w:w="2700"/>
             <w:shd w:fill="1C2B2D" w:val="clear"/>
             <w:tcMar>
               <w:top w:type="dxa" w:w="60"/>
@@ -1978,30 +2030,6 @@
                 <w:sz w:val="19"/>
                 <w:szCs w:val="19"/>
               </w:rPr>
-              <w:t xml:space="preserve">Could AI take this on? (Fully / AI drafts, I finish / Not really)</w:t>
-            </w:r>
-          </w:p>
-        </w:tc>
-        <w:tc>
-          <w:tcPr>
-            <w:tcW w:type="dxa" w:w="2100"/>
-            <w:shd w:fill="1C2B2D" w:val="clear"/>
-            <w:tcMar>
-              <w:top w:type="dxa" w:w="60"/>
-              <w:left w:type="dxa" w:w="100"/>
-              <w:bottom w:type="dxa" w:w="60"/>
-              <w:right w:type="dxa" w:w="100"/>
-            </w:tcMar>
-          </w:tcPr>
-          <w:p>
-            <w:r>
-              <w:rPr>
-                <w:b/>
-                <w:bCs/>
-                <w:color w:val="FFFFFF"/>
-                <w:sz w:val="19"/>
-                <w:szCs w:val="19"/>
-              </w:rPr>
               <w:t xml:space="preserve">How meaningful is this task to you personally? (1 not at all - 5 very)</w:t>
             </w:r>
           </w:p>
@@ -2010,7 +2038,7 @@
       <w:tr>
         <w:tc>
           <w:tcPr>
-            <w:tcW w:type="dxa" w:w="2600"/>
+            <w:tcW w:type="dxa" w:w="3300"/>
             <w:tcMar>
               <w:top w:type="dxa" w:w="60"/>
               <w:left w:type="dxa" w:w="100"/>
@@ -2027,13 +2055,13 @@
                 <w:sz w:val="19"/>
                 <w:szCs w:val="19"/>
               </w:rPr>
-              <w:t xml:space="preserve">[Task bank row 1]</w:t>
-            </w:r>
-          </w:p>
-        </w:tc>
-        <w:tc>
-          <w:tcPr>
-            <w:tcW w:type="dxa" w:w="2200"/>
+              <w:t xml:space="preserve">[Piped task 1]</w:t>
+            </w:r>
+          </w:p>
+        </w:tc>
+        <w:tc>
+          <w:tcPr>
+            <w:tcW w:type="dxa" w:w="3500"/>
             <w:tcMar>
               <w:top w:type="dxa" w:w="60"/>
               <w:left w:type="dxa" w:w="100"/>
@@ -2050,13 +2078,13 @@
                 <w:sz w:val="19"/>
                 <w:szCs w:val="19"/>
               </w:rPr>
-              <w:t xml:space="preserve">○ Y  ○ N</w:t>
-            </w:r>
-          </w:p>
-        </w:tc>
-        <w:tc>
-          <w:tcPr>
-            <w:tcW w:type="dxa" w:w="2600"/>
+              <w:t xml:space="preserve">○ / ○ / ○</w:t>
+            </w:r>
+          </w:p>
+        </w:tc>
+        <w:tc>
+          <w:tcPr>
+            <w:tcW w:type="dxa" w:w="2700"/>
             <w:tcMar>
               <w:top w:type="dxa" w:w="60"/>
               <w:left w:type="dxa" w:w="100"/>
@@ -2073,13 +2101,15 @@
                 <w:sz w:val="19"/>
                 <w:szCs w:val="19"/>
               </w:rPr>
-              <w:t xml:space="preserve">○ / ○ / ○</w:t>
-            </w:r>
-          </w:p>
-        </w:tc>
-        <w:tc>
-          <w:tcPr>
-            <w:tcW w:type="dxa" w:w="2100"/>
+              <w:t xml:space="preserve">1  2  3  4  5</w:t>
+            </w:r>
+          </w:p>
+        </w:tc>
+      </w:tr>
+      <w:tr>
+        <w:tc>
+          <w:tcPr>
+            <w:tcW w:type="dxa" w:w="3300"/>
             <w:tcMar>
               <w:top w:type="dxa" w:w="60"/>
               <w:left w:type="dxa" w:w="100"/>
@@ -2096,15 +2126,13 @@
                 <w:sz w:val="19"/>
                 <w:szCs w:val="19"/>
               </w:rPr>
-              <w:t xml:space="preserve">1  2  3  4  5</w:t>
-            </w:r>
-          </w:p>
-        </w:tc>
-      </w:tr>
-      <w:tr>
-        <w:tc>
-          <w:tcPr>
-            <w:tcW w:type="dxa" w:w="2600"/>
+              <w:t xml:space="preserve">[Piped task 2]</w:t>
+            </w:r>
+          </w:p>
+        </w:tc>
+        <w:tc>
+          <w:tcPr>
+            <w:tcW w:type="dxa" w:w="3500"/>
             <w:tcMar>
               <w:top w:type="dxa" w:w="60"/>
               <w:left w:type="dxa" w:w="100"/>
@@ -2121,59 +2149,13 @@
                 <w:sz w:val="19"/>
                 <w:szCs w:val="19"/>
               </w:rPr>
-              <w:t xml:space="preserve">[Task bank row 2]</w:t>
-            </w:r>
-          </w:p>
-        </w:tc>
-        <w:tc>
-          <w:tcPr>
-            <w:tcW w:type="dxa" w:w="2200"/>
-            <w:tcMar>
-              <w:top w:type="dxa" w:w="60"/>
-              <w:left w:type="dxa" w:w="100"/>
-              <w:bottom w:type="dxa" w:w="60"/>
-              <w:right w:type="dxa" w:w="100"/>
-            </w:tcMar>
-          </w:tcPr>
-          <w:p>
-            <w:r>
-              <w:rPr>
-                <w:b w:val="false"/>
-                <w:bCs w:val="false"/>
-                <w:color w:val="1C2B2D"/>
-                <w:sz w:val="19"/>
-                <w:szCs w:val="19"/>
-              </w:rPr>
-              <w:t xml:space="preserve">○ Y  ○ N</w:t>
-            </w:r>
-          </w:p>
-        </w:tc>
-        <w:tc>
-          <w:tcPr>
-            <w:tcW w:type="dxa" w:w="2600"/>
-            <w:tcMar>
-              <w:top w:type="dxa" w:w="60"/>
-              <w:left w:type="dxa" w:w="100"/>
-              <w:bottom w:type="dxa" w:w="60"/>
-              <w:right w:type="dxa" w:w="100"/>
-            </w:tcMar>
-          </w:tcPr>
-          <w:p>
-            <w:r>
-              <w:rPr>
-                <w:b w:val="false"/>
-                <w:bCs w:val="false"/>
-                <w:color w:val="1C2B2D"/>
-                <w:sz w:val="19"/>
-                <w:szCs w:val="19"/>
-              </w:rPr>
               <w:t xml:space="preserve">○ / ○ / ○</w:t>
             </w:r>
           </w:p>
         </w:tc>
         <w:tc>
           <w:tcPr>
-            <w:tcW w:type="dxa" w:w="2100"/>
+            <w:tcW w:type="dxa" w:w="2700"/>
             <w:tcMar>
               <w:top w:type="dxa" w:w="60"/>
               <w:left w:type="dxa" w:w="100"/>
@@ -2231,7 +2213,7 @@
           <w:sz w:val="20"/>
           <w:szCs w:val="20"/>
         </w:rPr>
-        <w:t xml:space="preserve">[Open end, encourage specificity, several lines]</w:t>
+        <w:t xml:space="preserve">[Open end, encourage specificity, several lines. Require a minimum response length, e.g. 15+ characters, to discourage low-effort one-word answers.]</w:t>
       </w:r>
     </w:p>
     <w:p>
@@ -2316,7 +2298,7 @@
           <w:sz w:val="20"/>
           <w:szCs w:val="20"/>
         </w:rPr>
-        <w:t xml:space="preserve">1 = Not at all confident, 7 = Extremely confident. [7-point scale]</w:t>
+        <w:t xml:space="preserve">1 = Not at all confident, 5 = Extremely confident. [5-point scale]</w:t>
       </w:r>
     </w:p>
     <w:p>
@@ -2354,7 +2336,7 @@
           <w:sz w:val="20"/>
           <w:szCs w:val="20"/>
         </w:rPr>
-        <w:t xml:space="preserve">1 = Not nearly as much, 7 = Just as much. [7-point scale]</w:t>
+        <w:t xml:space="preserve">1 = Not nearly as much, 5 = Just as much. [5-point scale]</w:t>
       </w:r>
     </w:p>
     <w:p>
@@ -2392,7 +2374,7 @@
           <w:sz w:val="20"/>
           <w:szCs w:val="20"/>
         </w:rPr>
-        <w:t xml:space="preserve">1 = Very hard, 7 = Very easy. [7-point scale]</w:t>
+        <w:t xml:space="preserve">1 = Very hard, 5 = Very easy. [5-point scale]</w:t>
       </w:r>
     </w:p>
     <w:p>
@@ -2585,7 +2567,7 @@
           <w:sz w:val="20"/>
           <w:szCs w:val="20"/>
         </w:rPr>
-        <w:t xml:space="preserve">1 = No say at all, 7 = Full say. [7-point scale]</w:t>
+        <w:t xml:space="preserve">1 = No say at all, 5 = Full say. [5-point scale]</w:t>
       </w:r>
     </w:p>
     <w:p>
@@ -2623,7 +2605,7 @@
           <w:sz w:val="20"/>
           <w:szCs w:val="20"/>
         </w:rPr>
-        <w:t xml:space="preserve">1 = Not at all, 7 = Completely. [7-point scale]</w:t>
+        <w:t xml:space="preserve">1 = Not at all, 5 = Completely. [5-point scale]</w:t>
       </w:r>
     </w:p>
     <w:p>
@@ -2684,7 +2666,22 @@
           <w:sz w:val="22"/>
           <w:szCs w:val="22"/>
         </w:rPr>
-        <w:t xml:space="preserve">If the company could only prioritize ONE of the following for AI investment over the next year, which should it be? Rank your top 3.</w:t>
+        <w:t xml:space="preserve">Investment priority exercise (MaxDiff).</w:t>
+      </w:r>
+    </w:p>
+    <w:p>
+      <w:pPr>
+        <w:spacing w:after="60"/>
+      </w:pPr>
+      <w:r>
+        <w:rPr>
+          <w:i/>
+          <w:iCs/>
+          <w:color w:val="555555"/>
+          <w:sz w:val="20"/>
+          <w:szCs w:val="20"/>
+        </w:rPr>
+        <w:t xml:space="preserve">Rather than a single ranked list, this is shown as a short series of small sets. Each respondent sees 4-5 sets of 4 items (drawn from the 5 priorities below, plus 'none of these'), and simply picks the MOST important and LEAST important in each set. Takes under a minute, and produces much more discriminating data than a static ranking, since it forces real trade-offs instead of letting everyone rate everything highly.</w:t>
       </w:r>
     </w:p>
     <w:p>
@@ -2699,7 +2696,19 @@
           <w:sz w:val="19"/>
           <w:szCs w:val="19"/>
         </w:rPr>
-        <w:t xml:space="preserve">[PROGRAMMER: RANDOMIZE ROW ORDER. RANKING OR MAXDIFF FORMAT, TBD BASED ON PLATFORM.]</w:t>
+        <w:t xml:space="preserve">[PROGRAMMER: STANDARD MAXDIFF DESIGN. 5 ITEMS BELOW (PLUS 'NONE OF THESE' AS A FIXED 6TH ITEM IN EVERY SET), SHOWN ACROSS 4-5 SETS OF 4 ITEMS PER RESPONDENT PER A BALANCED INCOMPLETE BLOCK DESIGN, GENERATE VIA SAWTOOTH/QUALTRICS MAXDIFF MODULE OR EQUIVALENT. EXAMPLE SET SHOWN BELOW FOR ILLUSTRATION ONLY, ACTUAL SETS ARE PLATFORM-GENERATED.]</w:t>
+      </w:r>
+    </w:p>
+    <w:p>
+      <w:pPr>
+        <w:spacing w:after="60"/>
+      </w:pPr>
+      <w:r>
+        <w:rPr>
+          <w:sz w:val="21"/>
+          <w:szCs w:val="21"/>
+        </w:rPr>
+        <w:t xml:space="preserve">Example of one set as the respondent would see it: "Of these four, which should be the company's TOP priority, and which should be LOWEST priority?"</w:t>
       </w:r>
     </w:p>
     <w:p>
@@ -2733,6 +2742,86 @@
           <w:sz w:val="21"/>
           <w:szCs w:val="21"/>
         </w:rPr>
+        <w:t xml:space="preserve">Client-facing AI capabilities (things we could offer clients)</w:t>
+      </w:r>
+    </w:p>
+    <w:p>
+      <w:pPr>
+        <w:pStyle w:val="ListParagraph"/>
+        <w:numPr>
+          <w:ilvl w:val="0"/>
+          <w:numId w:val="1"/>
+        </w:numPr>
+        <w:spacing w:after="30"/>
+      </w:pPr>
+      <w:r>
+        <w:rPr>
+          <w:sz w:val="21"/>
+          <w:szCs w:val="21"/>
+        </w:rPr>
+        <w:t xml:space="preserve">Training and skill-building so people can use AI well</w:t>
+      </w:r>
+    </w:p>
+    <w:p>
+      <w:pPr>
+        <w:pStyle w:val="ListParagraph"/>
+        <w:numPr>
+          <w:ilvl w:val="0"/>
+          <w:numId w:val="1"/>
+        </w:numPr>
+        <w:spacing w:after="30"/>
+      </w:pPr>
+      <w:r>
+        <w:rPr>
+          <w:sz w:val="21"/>
+          <w:szCs w:val="21"/>
+        </w:rPr>
+        <w:t xml:space="preserve">Governance, data security, and clear rules for appropriate use</w:t>
+      </w:r>
+    </w:p>
+    <w:p>
+      <w:pPr>
+        <w:spacing w:after="40"/>
+      </w:pPr>
+      <w:r>
+        <w:rPr>
+          <w:sz w:val="21"/>
+          <w:szCs w:val="21"/>
+        </w:rPr>
+        <w:t xml:space="preserve">Full item list used across all sets:</w:t>
+      </w:r>
+    </w:p>
+    <w:p>
+      <w:pPr>
+        <w:pStyle w:val="ListParagraph"/>
+        <w:numPr>
+          <w:ilvl w:val="0"/>
+          <w:numId w:val="1"/>
+        </w:numPr>
+        <w:spacing w:after="30"/>
+      </w:pPr>
+      <w:r>
+        <w:rPr>
+          <w:sz w:val="21"/>
+          <w:szCs w:val="21"/>
+        </w:rPr>
+        <w:t xml:space="preserve">Tools that make existing work faster / more efficient</w:t>
+      </w:r>
+    </w:p>
+    <w:p>
+      <w:pPr>
+        <w:pStyle w:val="ListParagraph"/>
+        <w:numPr>
+          <w:ilvl w:val="0"/>
+          <w:numId w:val="1"/>
+        </w:numPr>
+        <w:spacing w:after="30"/>
+      </w:pPr>
+      <w:r>
+        <w:rPr>
+          <w:sz w:val="21"/>
+          <w:szCs w:val="21"/>
+        </w:rPr>
         <w:t xml:space="preserve">Tools that improve quality or accuracy of output</w:t>
       </w:r>
     </w:p>
@@ -2785,23 +2874,6 @@
           <w:szCs w:val="21"/>
         </w:rPr>
         <w:t xml:space="preserve">Governance, data security, and clear rules for appropriate use</w:t>
-      </w:r>
-    </w:p>
-    <w:p>
-      <w:pPr>
-        <w:pStyle w:val="ListParagraph"/>
-        <w:numPr>
-          <w:ilvl w:val="0"/>
-          <w:numId w:val="1"/>
-        </w:numPr>
-        <w:spacing w:after="30"/>
-      </w:pPr>
-      <w:r>
-        <w:rPr>
-          <w:sz w:val="21"/>
-          <w:szCs w:val="21"/>
-        </w:rPr>
-        <w:t xml:space="preserve">None of these should be the priority right now</w:t>
       </w:r>
     </w:p>
     <w:p>
@@ -2906,7 +2978,7 @@
           <w:sz w:val="21"/>
           <w:szCs w:val="21"/>
         </w:rPr>
-        <w:t xml:space="preserve">Confirm the actual service line list and title/level taxonomy for A1 and A2.</w:t>
+        <w:t xml:space="preserve">A1 and A2 are open text, decide during analysis whether to code responses into standardized service line and title/level buckets for reporting.</w:t>
       </w:r>
     </w:p>
     <w:p>
@@ -2940,24 +3012,24 @@
           <w:sz w:val="21"/>
           <w:szCs w:val="21"/>
         </w:rPr>
-        <w:t xml:space="preserve">Decide whether Section D's task-by-task grid is fielded in full or trimmed to the 8-10 highest-relevance task types, the full list may run long for a self-administered survey.</w:t>
-      </w:r>
-    </w:p>
-    <w:p>
-      <w:pPr>
-        <w:pStyle w:val="ListParagraph"/>
-        <w:numPr>
-          <w:ilvl w:val="0"/>
-          <w:numId w:val="1"/>
-        </w:numPr>
-        <w:spacing w:after="30"/>
-      </w:pPr>
-      <w:r>
-        <w:rPr>
-          <w:sz w:val="21"/>
-          <w:szCs w:val="21"/>
-        </w:rPr>
-        <w:t xml:space="preserve">Decide on the ranking/MaxDiff method for F4 based on the survey platform available.</w:t>
+        <w:t xml:space="preserve">D1/D1a is now adaptive (filter, then a capped 8-row grid of only selected tasks) to control length and reduce straightlining, confirm the 8-row cap is right for your platform's typical completion time budget.</w:t>
+      </w:r>
+    </w:p>
+    <w:p>
+      <w:pPr>
+        <w:pStyle w:val="ListParagraph"/>
+        <w:numPr>
+          <w:ilvl w:val="0"/>
+          <w:numId w:val="1"/>
+        </w:numPr>
+        <w:spacing w:after="30"/>
+      </w:pPr>
+      <w:r>
+        <w:rPr>
+          <w:sz w:val="21"/>
+          <w:szCs w:val="21"/>
+        </w:rPr>
+        <w:t xml:space="preserve">F4 is now designed as MaxDiff rather than a static ranked list, confirm your survey platform (Qualtrics, Sawtooth, etc.) supports a MaxDiff module, if not, a simplified paired-comparison version can substitute.</w:t>
       </w:r>
     </w:p>
     <w:p>
@@ -2975,6 +3047,112 @@
           <w:szCs w:val="21"/>
         </w:rPr>
         <w:t xml:space="preserve">Consider a shorter pulse-check version of this instrument for future quarterly tracking, once this longer baseline is fielded once.</w:t>
+      </w:r>
+    </w:p>
+    <w:p>
+      <w:pPr>
+        <w:pStyle w:val="Heading1"/>
+        <w:spacing w:after="100" w:before="260"/>
+      </w:pPr>
+      <w:r>
+        <w:t xml:space="preserve">Fielding &amp; Representativeness Plan</w:t>
+      </w:r>
+    </w:p>
+    <w:p>
+      <w:pPr>
+        <w:spacing w:after="80"/>
+      </w:pPr>
+      <w:r>
+        <w:rPr>
+          <w:sz w:val="21"/>
+          <w:szCs w:val="21"/>
+        </w:rPr>
+        <w:t xml:space="preserve">Anonymous and voluntary is the right call for honesty, people won't tell the truth about AI usage or trust if they think it's traceable to them. But voluntary response also skews toward people with the strongest opinions in either direction, which is the wrong skew for something reported to the CEO as "what the company thinks." Build these in before fielding, not after:</w:t>
+      </w:r>
+    </w:p>
+    <w:p>
+      <w:pPr>
+        <w:pStyle w:val="ListParagraph"/>
+        <w:numPr>
+          <w:ilvl w:val="0"/>
+          <w:numId w:val="1"/>
+        </w:numPr>
+        <w:spacing w:after="30"/>
+      </w:pPr>
+      <w:r>
+        <w:rPr>
+          <w:sz w:val="21"/>
+          <w:szCs w:val="21"/>
+        </w:rPr>
+        <w:t xml:space="preserve">Set a minimum target N per service line and per coded title/level bucket before calling the results reportable at that cut, segments below the minimum should be reported directionally or combined with an adjacent segment, not presented with false precision.</w:t>
+      </w:r>
+    </w:p>
+    <w:p>
+      <w:pPr>
+        <w:pStyle w:val="ListParagraph"/>
+        <w:numPr>
+          <w:ilvl w:val="0"/>
+          <w:numId w:val="1"/>
+        </w:numPr>
+        <w:spacing w:after="30"/>
+      </w:pPr>
+      <w:r>
+        <w:rPr>
+          <w:sz w:val="21"/>
+          <w:szCs w:val="21"/>
+        </w:rPr>
+        <w:t xml:space="preserve">Track completion by service line as the survey is live, not just at the end, low-responding segments need a targeted reminder while the survey is still open, not a caveat added after the fact.</w:t>
+      </w:r>
+    </w:p>
+    <w:p>
+      <w:pPr>
+        <w:pStyle w:val="ListParagraph"/>
+        <w:numPr>
+          <w:ilvl w:val="0"/>
+          <w:numId w:val="1"/>
+        </w:numPr>
+        <w:spacing w:after="30"/>
+      </w:pPr>
+      <w:r>
+        <w:rPr>
+          <w:sz w:val="21"/>
+          <w:szCs w:val="21"/>
+        </w:rPr>
+        <w:t xml:space="preserve">Have a named owner (likely whoever leads the AI alignment initiative) sending a reminder at the halfway point of the field window, response typically drops off fast after the first 48 hours without one.</w:t>
+      </w:r>
+    </w:p>
+    <w:p>
+      <w:pPr>
+        <w:pStyle w:val="ListParagraph"/>
+        <w:numPr>
+          <w:ilvl w:val="0"/>
+          <w:numId w:val="1"/>
+        </w:numPr>
+        <w:spacing w:after="30"/>
+      </w:pPr>
+      <w:r>
+        <w:rPr>
+          <w:sz w:val="21"/>
+          <w:szCs w:val="21"/>
+        </w:rPr>
+        <w:t xml:space="preserve">Decide the field window length upfront, long enough for people to find time, short enough that the AI landscape hasn't shifted underneath the results, 2 weeks is a reasonable default.</w:t>
+      </w:r>
+    </w:p>
+    <w:p>
+      <w:pPr>
+        <w:pStyle w:val="ListParagraph"/>
+        <w:numPr>
+          <w:ilvl w:val="0"/>
+          <w:numId w:val="1"/>
+        </w:numPr>
+        <w:spacing w:after="30"/>
+      </w:pPr>
+      <w:r>
+        <w:rPr>
+          <w:sz w:val="21"/>
+          <w:szCs w:val="21"/>
+        </w:rPr>
+        <w:t xml:space="preserve">State anonymity plainly at the very start of the survey (already drafted in the introduction) and again briefly before any sensitive question (E1-E5, F1-F2), reassurance placed once at the top is often forgotten by the time respondents reach harder questions.</w:t>
       </w:r>
     </w:p>
     <w:sectPr>

</xml_diff>